<commit_message>
Update indigency template selection logic and frontend options
</commit_message>
<xml_diff>
--- a/brgy_forms/certification/JOBSEEKER_CERT_NEW.docx
+++ b/brgy_forms/certification/JOBSEEKER_CERT_NEW.docx
@@ -397,6 +397,8 @@
         </w:rPr>
         <w:t>C E R T I F I C A T I O N</w:t>
       </w:r>
+      <w:bookmarkStart w:id="0" w:name="_GoBack"/>
+      <w:bookmarkEnd w:id="0"/>
       <w:r>
         <w:rPr>
           <w:rFonts w:ascii="Times New Roman" w:hAnsi="Times New Roman" w:eastAsia="BatangChe" w:cs="Times New Roman"/>
@@ -1086,8 +1088,6 @@
           <w:rFonts w:ascii="Times New Roman" w:hAnsi="Times New Roman" w:cs="Times New Roman"/>
         </w:rPr>
       </w:pPr>
-      <w:bookmarkStart w:id="0" w:name="_GoBack"/>
-      <w:bookmarkEnd w:id="0"/>
     </w:p>
     <w:sectPr>
       <w:pgSz w:w="11906" w:h="16838"/>
@@ -1225,7 +1225,7 @@
     <w:lsdException w:qFormat="1" w:unhideWhenUsed="0" w:uiPriority="10" w:semiHidden="0" w:name="Title"/>
     <w:lsdException w:uiPriority="99" w:name="Closing"/>
     <w:lsdException w:uiPriority="99" w:name="Signature"/>
-    <w:lsdException w:uiPriority="1" w:name="Default Paragraph Font"/>
+    <w:lsdException w:qFormat="1" w:uiPriority="1" w:name="Default Paragraph Font"/>
     <w:lsdException w:uiPriority="99" w:name="Body Text"/>
     <w:lsdException w:uiPriority="99" w:name="Body Text Indent"/>
     <w:lsdException w:uiPriority="99" w:name="List Continue"/>
@@ -1263,7 +1263,7 @@
     <w:lsdException w:uiPriority="99" w:name="HTML Sample"/>
     <w:lsdException w:uiPriority="99" w:name="HTML Typewriter"/>
     <w:lsdException w:uiPriority="99" w:name="HTML Variable"/>
-    <w:lsdException w:uiPriority="99" w:name="Normal Table"/>
+    <w:lsdException w:qFormat="1" w:uiPriority="99" w:name="Normal Table"/>
     <w:lsdException w:uiPriority="99" w:name="annotation subject"/>
     <w:lsdException w:uiPriority="99" w:name="Table Simple 1"/>
     <w:lsdException w:uiPriority="99" w:name="Table Simple 2"/>
@@ -1427,12 +1427,14 @@
     <w:name w:val="Default Paragraph Font"/>
     <w:semiHidden/>
     <w:unhideWhenUsed/>
+    <w:qFormat/>
     <w:uiPriority w:val="1"/>
   </w:style>
   <w:style w:type="table" w:default="1" w:styleId="3">
     <w:name w:val="Normal Table"/>
     <w:semiHidden/>
     <w:unhideWhenUsed/>
+    <w:qFormat/>
     <w:uiPriority w:val="99"/>
     <w:tblPr>
       <w:tblCellMar>
@@ -1465,6 +1467,7 @@
     <w:name w:val="Title Char"/>
     <w:basedOn w:val="2"/>
     <w:link w:val="4"/>
+    <w:qFormat/>
     <w:uiPriority w:val="10"/>
     <w:rPr>
       <w:rFonts w:ascii="Arial" w:hAnsi="Arial" w:eastAsia="Times New Roman" w:cs="Arial"/>

</xml_diff>